<commit_message>
working on appointments but will stop and continuo on other tables first
</commit_message>
<xml_diff>
--- a/Database_V1/Proceduers_Triggers_Documents/Proceduers_LIst.docx
+++ b/Database_V1/Proceduers_Triggers_Documents/Proceduers_LIst.docx
@@ -406,6 +406,7 @@
       </w:r>
       <w:proofErr w:type="spellEnd"/>
     </w:p>
+    <w:p/>
     <w:p>
       <w:proofErr w:type="spellStart"/>
       <w:r>
@@ -560,543 +561,543 @@
     <w:p>
       <w:proofErr w:type="spellStart"/>
       <w:r>
+        <w:lastRenderedPageBreak/>
         <w:t>usp_Encounter_GetActive</w:t>
       </w:r>
       <w:proofErr w:type="spellEnd"/>
     </w:p>
     <w:p>
       <w:r>
+        <w:t>Vital Signs Procedures</w:t>
+      </w:r>
+    </w:p>
+    <w:p>
+      <w:r>
+        <w:t>text</w:t>
+      </w:r>
+    </w:p>
+    <w:p>
+      <w:proofErr w:type="spellStart"/>
+      <w:r>
+        <w:t>usp_VitalSigns_Record</w:t>
+      </w:r>
+      <w:proofErr w:type="spellEnd"/>
+    </w:p>
+    <w:p>
+      <w:proofErr w:type="spellStart"/>
+      <w:r>
+        <w:t>usp_VitalSigns_GetByEncounter</w:t>
+      </w:r>
+      <w:proofErr w:type="spellEnd"/>
+    </w:p>
+    <w:p>
+      <w:proofErr w:type="spellStart"/>
+      <w:r>
+        <w:t>usp_VitalSigns_GetTrends</w:t>
+      </w:r>
+      <w:proofErr w:type="spellEnd"/>
+    </w:p>
+    <w:p/>
+    <w:p>
+      <w:r>
+        <w:t>Diagnosis Procedures</w:t>
+      </w:r>
+    </w:p>
+    <w:p>
+      <w:r>
+        <w:t>text</w:t>
+      </w:r>
+    </w:p>
+    <w:p>
+      <w:proofErr w:type="spellStart"/>
+      <w:r>
+        <w:t>usp_Diagnosis_Add</w:t>
+      </w:r>
+      <w:proofErr w:type="spellEnd"/>
+    </w:p>
+    <w:p>
+      <w:proofErr w:type="spellStart"/>
+      <w:r>
+        <w:t>usp_Diagnosis_Update</w:t>
+      </w:r>
+      <w:proofErr w:type="spellEnd"/>
+    </w:p>
+    <w:p>
+      <w:proofErr w:type="spellStart"/>
+      <w:r>
+        <w:t>usp_Diagnosis_Resolve</w:t>
+      </w:r>
+      <w:proofErr w:type="spellEnd"/>
+    </w:p>
+    <w:p>
+      <w:proofErr w:type="spellStart"/>
+      <w:r>
+        <w:t>usp_Diagnosis_GetByPatient</w:t>
+      </w:r>
+      <w:proofErr w:type="spellEnd"/>
+    </w:p>
+    <w:p>
+      <w:proofErr w:type="spellStart"/>
+      <w:r>
+        <w:t>usp_Diagnosis_GetByEncounter</w:t>
+      </w:r>
+      <w:proofErr w:type="spellEnd"/>
+    </w:p>
+    <w:p/>
+    <w:p>
+      <w:r>
+        <w:t>Prescription Procedures</w:t>
+      </w:r>
+    </w:p>
+    <w:p>
+      <w:r>
+        <w:t>text</w:t>
+      </w:r>
+    </w:p>
+    <w:p>
+      <w:proofErr w:type="spellStart"/>
+      <w:r>
+        <w:t>usp_Prescription_Prescribe</w:t>
+      </w:r>
+      <w:proofErr w:type="spellEnd"/>
+    </w:p>
+    <w:p>
+      <w:proofErr w:type="spellStart"/>
+      <w:r>
+        <w:t>usp_Prescription_Update</w:t>
+      </w:r>
+      <w:proofErr w:type="spellEnd"/>
+    </w:p>
+    <w:p>
+      <w:proofErr w:type="spellStart"/>
+      <w:r>
+        <w:t>usp_Prescription_Cancel</w:t>
+      </w:r>
+      <w:proofErr w:type="spellEnd"/>
+    </w:p>
+    <w:p>
+      <w:proofErr w:type="spellStart"/>
+      <w:r>
+        <w:t>usp_Prescription_GetByPatient</w:t>
+      </w:r>
+      <w:proofErr w:type="spellEnd"/>
+    </w:p>
+    <w:p>
+      <w:proofErr w:type="spellStart"/>
+      <w:r>
+        <w:t>usp_Prescription_GetActive</w:t>
+      </w:r>
+      <w:proofErr w:type="spellEnd"/>
+    </w:p>
+    <w:p/>
+    <w:p>
+      <w:r>
+        <w:t>ORDER MANAGEMENT PROCEDURES</w:t>
+      </w:r>
+    </w:p>
+    <w:p>
+      <w:r>
+        <w:t>text</w:t>
+      </w:r>
+    </w:p>
+    <w:p>
+      <w:proofErr w:type="spellStart"/>
+      <w:r>
+        <w:t>usp_Order_Create</w:t>
+      </w:r>
+      <w:proofErr w:type="spellEnd"/>
+    </w:p>
+    <w:p>
+      <w:proofErr w:type="spellStart"/>
+      <w:r>
+        <w:t>usp_Order_UpdateStatus</w:t>
+      </w:r>
+      <w:proofErr w:type="spellEnd"/>
+    </w:p>
+    <w:p>
+      <w:proofErr w:type="spellStart"/>
+      <w:r>
+        <w:t>usp_Order_GetByEncounter</w:t>
+      </w:r>
+      <w:proofErr w:type="spellEnd"/>
+    </w:p>
+    <w:p>
+      <w:proofErr w:type="spellStart"/>
+      <w:r>
+        <w:t>usp_Order_GetByPatient</w:t>
+      </w:r>
+      <w:proofErr w:type="spellEnd"/>
+    </w:p>
+    <w:p/>
+    <w:p>
+      <w:r>
+        <w:t>INPATIENT MANAGEMENT PROCEDURES</w:t>
+      </w:r>
+    </w:p>
+    <w:p>
+      <w:r>
+        <w:t>Admission Procedures</w:t>
+      </w:r>
+    </w:p>
+    <w:p>
+      <w:r>
+        <w:t>text</w:t>
+      </w:r>
+    </w:p>
+    <w:p>
+      <w:proofErr w:type="spellStart"/>
+      <w:r>
+        <w:t>usp_Admission_AdmitPatient</w:t>
+      </w:r>
+      <w:proofErr w:type="spellEnd"/>
+    </w:p>
+    <w:p>
+      <w:proofErr w:type="spellStart"/>
+      <w:r>
+        <w:t>usp_Admission_DischargePatient</w:t>
+      </w:r>
+      <w:proofErr w:type="spellEnd"/>
+    </w:p>
+    <w:p>
+      <w:proofErr w:type="spellStart"/>
+      <w:r>
+        <w:t>usp_Admission_TransferPatient</w:t>
+      </w:r>
+      <w:proofErr w:type="spellEnd"/>
+    </w:p>
+    <w:p>
+      <w:proofErr w:type="spellStart"/>
+      <w:r>
+        <w:t>usp_Admission_GetActive</w:t>
+      </w:r>
+      <w:proofErr w:type="spellEnd"/>
+    </w:p>
+    <w:p>
+      <w:proofErr w:type="spellStart"/>
+      <w:r>
+        <w:t>usp_Admission_GetByPatient</w:t>
+      </w:r>
+      <w:proofErr w:type="spellEnd"/>
+    </w:p>
+    <w:p>
+      <w:r>
+        <w:t>Bed Management Procedures</w:t>
+      </w:r>
+    </w:p>
+    <w:p>
+      <w:r>
+        <w:t>text</w:t>
+      </w:r>
+    </w:p>
+    <w:p>
+      <w:proofErr w:type="spellStart"/>
+      <w:r>
+        <w:t>usp_Bed_GetAvailable</w:t>
+      </w:r>
+      <w:proofErr w:type="spellEnd"/>
+    </w:p>
+    <w:p>
+      <w:proofErr w:type="spellStart"/>
+      <w:r>
+        <w:t>usp_Bed_UpdateStatus</w:t>
+      </w:r>
+      <w:proofErr w:type="spellEnd"/>
+    </w:p>
+    <w:p>
+      <w:proofErr w:type="spellStart"/>
+      <w:r>
+        <w:t>usp_Bed_GetByWard</w:t>
+      </w:r>
+      <w:proofErr w:type="spellEnd"/>
+    </w:p>
+    <w:p>
+      <w:r>
+        <w:t>Ward Procedures</w:t>
+      </w:r>
+    </w:p>
+    <w:p>
+      <w:r>
+        <w:t>text</w:t>
+      </w:r>
+    </w:p>
+    <w:p>
+      <w:proofErr w:type="spellStart"/>
+      <w:r>
+        <w:t>usp_Ward_GetAll</w:t>
+      </w:r>
+      <w:proofErr w:type="spellEnd"/>
+    </w:p>
+    <w:p>
+      <w:proofErr w:type="spellStart"/>
+      <w:r>
+        <w:t>usp_Ward_GetAvailableBeds</w:t>
+      </w:r>
+      <w:proofErr w:type="spellEnd"/>
+    </w:p>
+    <w:p>
+      <w:r>
+        <w:t>EMERGENCY MANAGEMENT PROCEDURES</w:t>
+      </w:r>
+    </w:p>
+    <w:p>
+      <w:r>
+        <w:t>text</w:t>
+      </w:r>
+    </w:p>
+    <w:p>
+      <w:proofErr w:type="spellStart"/>
+      <w:r>
+        <w:t>usp_ERVisit_Register</w:t>
+      </w:r>
+      <w:proofErr w:type="spellEnd"/>
+    </w:p>
+    <w:p>
+      <w:proofErr w:type="spellStart"/>
+      <w:r>
+        <w:t>usp_ERVisit_UpdateDisposition</w:t>
+      </w:r>
+      <w:proofErr w:type="spellEnd"/>
+    </w:p>
+    <w:p>
+      <w:proofErr w:type="spellStart"/>
+      <w:r>
+        <w:t>usp_Triage_RecordAssessment</w:t>
+      </w:r>
+      <w:proofErr w:type="spellEnd"/>
+    </w:p>
+    <w:p>
+      <w:proofErr w:type="spellStart"/>
+      <w:r>
+        <w:t>usp_ERVisit_GetActive</w:t>
+      </w:r>
+      <w:proofErr w:type="spellEnd"/>
+    </w:p>
+    <w:p>
+      <w:r>
+        <w:t>OUTPATIENT MANAGEMENT PROCEDURES</w:t>
+      </w:r>
+    </w:p>
+    <w:p>
+      <w:r>
+        <w:t>text</w:t>
+      </w:r>
+    </w:p>
+    <w:p>
+      <w:proofErr w:type="spellStart"/>
+      <w:r>
+        <w:t>usp_OPDVisit_Register</w:t>
+      </w:r>
+      <w:proofErr w:type="spellEnd"/>
+    </w:p>
+    <w:p>
+      <w:proofErr w:type="spellStart"/>
+      <w:r>
+        <w:t>usp_OPDVisit_UpdateStatus</w:t>
+      </w:r>
+      <w:proofErr w:type="spellEnd"/>
+    </w:p>
+    <w:p>
+      <w:proofErr w:type="spellStart"/>
+      <w:r>
+        <w:t>usp_OPDVisit_GetByDate</w:t>
+      </w:r>
+      <w:proofErr w:type="spellEnd"/>
+    </w:p>
+    <w:p>
+      <w:r>
         <w:lastRenderedPageBreak/>
-        <w:t>Vital Signs Procedures</w:t>
-      </w:r>
-    </w:p>
-    <w:p>
-      <w:r>
-        <w:t>text</w:t>
-      </w:r>
-    </w:p>
-    <w:p>
-      <w:proofErr w:type="spellStart"/>
-      <w:r>
-        <w:t>usp_VitalSigns_Record</w:t>
-      </w:r>
-      <w:proofErr w:type="spellEnd"/>
-    </w:p>
-    <w:p>
-      <w:proofErr w:type="spellStart"/>
-      <w:r>
-        <w:t>usp_VitalSigns_GetByEncounter</w:t>
-      </w:r>
-      <w:proofErr w:type="spellEnd"/>
-    </w:p>
-    <w:p>
-      <w:proofErr w:type="spellStart"/>
-      <w:r>
-        <w:t>usp_VitalSigns_GetTrends</w:t>
-      </w:r>
-      <w:proofErr w:type="spellEnd"/>
-    </w:p>
-    <w:p/>
-    <w:p>
-      <w:r>
-        <w:t>Diagnosis Procedures</w:t>
-      </w:r>
-    </w:p>
-    <w:p>
-      <w:r>
-        <w:t>text</w:t>
-      </w:r>
-    </w:p>
-    <w:p>
-      <w:proofErr w:type="spellStart"/>
-      <w:r>
-        <w:t>usp_Diagnosis_Add</w:t>
-      </w:r>
-      <w:proofErr w:type="spellEnd"/>
-    </w:p>
-    <w:p>
-      <w:proofErr w:type="spellStart"/>
-      <w:r>
-        <w:t>usp_Diagnosis_Update</w:t>
-      </w:r>
-      <w:proofErr w:type="spellEnd"/>
-    </w:p>
-    <w:p>
-      <w:proofErr w:type="spellStart"/>
-      <w:r>
-        <w:t>usp_Diagnosis_Resolve</w:t>
-      </w:r>
-      <w:proofErr w:type="spellEnd"/>
-    </w:p>
-    <w:p>
-      <w:proofErr w:type="spellStart"/>
-      <w:r>
-        <w:t>usp_Diagnosis_GetByPatient</w:t>
-      </w:r>
-      <w:proofErr w:type="spellEnd"/>
-    </w:p>
-    <w:p>
-      <w:proofErr w:type="spellStart"/>
-      <w:r>
-        <w:t>usp_Diagnosis_GetByEncounter</w:t>
-      </w:r>
-      <w:proofErr w:type="spellEnd"/>
-    </w:p>
-    <w:p/>
-    <w:p>
-      <w:r>
-        <w:t>Prescription Procedures</w:t>
-      </w:r>
-    </w:p>
-    <w:p>
-      <w:r>
-        <w:t>text</w:t>
-      </w:r>
-    </w:p>
-    <w:p>
-      <w:proofErr w:type="spellStart"/>
-      <w:r>
-        <w:t>usp_Prescription_Prescribe</w:t>
-      </w:r>
-      <w:proofErr w:type="spellEnd"/>
-    </w:p>
-    <w:p>
-      <w:proofErr w:type="spellStart"/>
-      <w:r>
-        <w:t>usp_Prescription_Update</w:t>
-      </w:r>
-      <w:proofErr w:type="spellEnd"/>
-    </w:p>
-    <w:p>
-      <w:proofErr w:type="spellStart"/>
-      <w:r>
-        <w:t>usp_Prescription_Cancel</w:t>
-      </w:r>
-      <w:proofErr w:type="spellEnd"/>
-    </w:p>
-    <w:p>
-      <w:proofErr w:type="spellStart"/>
-      <w:r>
-        <w:t>usp_Prescription_GetByPatient</w:t>
-      </w:r>
-      <w:proofErr w:type="spellEnd"/>
-    </w:p>
-    <w:p>
-      <w:proofErr w:type="spellStart"/>
-      <w:r>
-        <w:t>usp_Prescription_GetActive</w:t>
-      </w:r>
-      <w:proofErr w:type="spellEnd"/>
-    </w:p>
-    <w:p/>
-    <w:p>
-      <w:r>
-        <w:t>ORDER MANAGEMENT PROCEDURES</w:t>
-      </w:r>
-    </w:p>
-    <w:p>
-      <w:r>
-        <w:t>text</w:t>
-      </w:r>
-    </w:p>
-    <w:p>
-      <w:proofErr w:type="spellStart"/>
-      <w:r>
-        <w:t>usp_Order_Create</w:t>
-      </w:r>
-      <w:proofErr w:type="spellEnd"/>
-    </w:p>
-    <w:p>
-      <w:proofErr w:type="spellStart"/>
-      <w:r>
-        <w:t>usp_Order_UpdateStatus</w:t>
-      </w:r>
-      <w:proofErr w:type="spellEnd"/>
-    </w:p>
-    <w:p>
-      <w:proofErr w:type="spellStart"/>
-      <w:r>
-        <w:t>usp_Order_GetByEncounter</w:t>
-      </w:r>
-      <w:proofErr w:type="spellEnd"/>
-    </w:p>
-    <w:p>
-      <w:proofErr w:type="spellStart"/>
-      <w:r>
-        <w:t>usp_Order_GetByPatient</w:t>
-      </w:r>
-      <w:proofErr w:type="spellEnd"/>
-    </w:p>
-    <w:p/>
-    <w:p>
+        <w:t>LABORATORY MANAGEMENT PROCEDURES</w:t>
+      </w:r>
+    </w:p>
+    <w:p>
+      <w:r>
+        <w:t>text</w:t>
+      </w:r>
+    </w:p>
+    <w:p>
+      <w:proofErr w:type="spellStart"/>
+      <w:r>
+        <w:t>usp_LabOrder_Create</w:t>
+      </w:r>
+      <w:proofErr w:type="spellEnd"/>
+    </w:p>
+    <w:p>
+      <w:proofErr w:type="spellStart"/>
+      <w:r>
+        <w:t>usp_LabOrder_UpdateStatus</w:t>
+      </w:r>
+      <w:proofErr w:type="spellEnd"/>
+    </w:p>
+    <w:p>
+      <w:proofErr w:type="spellStart"/>
+      <w:r>
+        <w:t>usp_LabResult_Enter</w:t>
+      </w:r>
+      <w:proofErr w:type="spellEnd"/>
+    </w:p>
+    <w:p>
+      <w:proofErr w:type="spellStart"/>
+      <w:r>
+        <w:t>usp_LabResult_Verify</w:t>
+      </w:r>
+      <w:proofErr w:type="spellEnd"/>
+    </w:p>
+    <w:p>
+      <w:proofErr w:type="spellStart"/>
+      <w:r>
+        <w:t>usp_LabOrder_GetPending</w:t>
+      </w:r>
+      <w:proofErr w:type="spellEnd"/>
+    </w:p>
+    <w:p>
+      <w:proofErr w:type="spellStart"/>
+      <w:r>
+        <w:t>usp_LabResult_GetByOrder</w:t>
+      </w:r>
+      <w:proofErr w:type="spellEnd"/>
+    </w:p>
+    <w:p>
+      <w:r>
+        <w:t>RADIOLOGY MANAGEMENT PROCEDURES</w:t>
+      </w:r>
+    </w:p>
+    <w:p>
+      <w:r>
+        <w:t>text</w:t>
+      </w:r>
+    </w:p>
+    <w:p>
+      <w:proofErr w:type="spellStart"/>
+      <w:r>
+        <w:t>usp_RadiologyOrder_Create</w:t>
+      </w:r>
+      <w:proofErr w:type="spellEnd"/>
+    </w:p>
+    <w:p>
+      <w:proofErr w:type="spellStart"/>
+      <w:r>
+        <w:t>usp_ImagingStudy_Schedule</w:t>
+      </w:r>
+      <w:proofErr w:type="spellEnd"/>
+    </w:p>
+    <w:p>
+      <w:proofErr w:type="spellStart"/>
+      <w:r>
+        <w:t>usp_RadiologyReport_Create</w:t>
+      </w:r>
+      <w:proofErr w:type="spellEnd"/>
+    </w:p>
+    <w:p>
+      <w:proofErr w:type="spellStart"/>
+      <w:r>
+        <w:t>usp_RadiologyReport_Update</w:t>
+      </w:r>
+      <w:proofErr w:type="spellEnd"/>
+    </w:p>
+    <w:p>
+      <w:proofErr w:type="spellStart"/>
+      <w:r>
+        <w:t>usp_ImagingStudy_GetByPatient</w:t>
+      </w:r>
+      <w:proofErr w:type="spellEnd"/>
+    </w:p>
+    <w:p>
+      <w:r>
+        <w:t>SURGERY MANAGEMENT PROCEDURES</w:t>
+      </w:r>
+    </w:p>
+    <w:p>
+      <w:r>
+        <w:t>text</w:t>
+      </w:r>
+    </w:p>
+    <w:p>
+      <w:proofErr w:type="spellStart"/>
+      <w:proofErr w:type="gramStart"/>
+      <w:r>
+        <w:t>usp</w:t>
+      </w:r>
+      <w:proofErr w:type="gramEnd"/>
+      <w:r>
+        <w:t>_Surgery_Schedule</w:t>
+      </w:r>
+      <w:proofErr w:type="spellEnd"/>
+    </w:p>
+    <w:p>
+      <w:proofErr w:type="spellStart"/>
+      <w:r>
+        <w:t>usp_Surgery_UpdateStatus</w:t>
+      </w:r>
+      <w:proofErr w:type="spellEnd"/>
+    </w:p>
+    <w:p>
+      <w:proofErr w:type="spellStart"/>
+      <w:r>
+        <w:t>usp_SurgeryTeam_Assign</w:t>
+      </w:r>
+      <w:proofErr w:type="spellEnd"/>
+    </w:p>
+    <w:p>
+      <w:proofErr w:type="spellStart"/>
+      <w:r>
+        <w:t>usp_SurgeryNotes_Record</w:t>
+      </w:r>
+      <w:proofErr w:type="spellEnd"/>
+    </w:p>
+    <w:p>
+      <w:proofErr w:type="spellStart"/>
+      <w:r>
+        <w:t>usp_Surgery_GetBySurgeon</w:t>
+      </w:r>
+      <w:proofErr w:type="spellEnd"/>
+    </w:p>
+    <w:p>
+      <w:proofErr w:type="spellStart"/>
+      <w:r>
+        <w:t>usp_Surgery_GetScheduled</w:t>
+      </w:r>
+      <w:proofErr w:type="spellEnd"/>
+    </w:p>
+    <w:p>
+      <w:r>
+        <w:t>FINANCE MANAGEMENT PROCEDURES</w:t>
+      </w:r>
+    </w:p>
+    <w:p>
+      <w:r>
+        <w:t>Billing Procedures</w:t>
+      </w:r>
+    </w:p>
+    <w:p>
+      <w:r>
+        <w:t>text</w:t>
+      </w:r>
+    </w:p>
+    <w:p>
+      <w:proofErr w:type="spellStart"/>
+      <w:r>
+        <w:t>usp_Invoice_Generate</w:t>
+      </w:r>
+      <w:proofErr w:type="spellEnd"/>
+    </w:p>
+    <w:p>
+      <w:proofErr w:type="spellStart"/>
+      <w:r>
+        <w:t>usp_Invoice_UpdateStatus</w:t>
+      </w:r>
+      <w:proofErr w:type="spellEnd"/>
+    </w:p>
+    <w:p>
+      <w:proofErr w:type="spellStart"/>
+      <w:r>
+        <w:t>usp_Payment_Process</w:t>
+      </w:r>
+      <w:proofErr w:type="spellEnd"/>
+    </w:p>
+    <w:p>
+      <w:proofErr w:type="spellStart"/>
       <w:r>
         <w:lastRenderedPageBreak/>
-        <w:t>INPATIENT MANAGEMENT PROCEDURES</w:t>
-      </w:r>
-    </w:p>
-    <w:p>
-      <w:r>
-        <w:t>Admission Procedures</w:t>
-      </w:r>
-    </w:p>
-    <w:p>
-      <w:r>
-        <w:t>text</w:t>
-      </w:r>
-    </w:p>
-    <w:p>
-      <w:proofErr w:type="spellStart"/>
-      <w:r>
-        <w:t>usp_Admission_AdmitPatient</w:t>
-      </w:r>
-      <w:proofErr w:type="spellEnd"/>
-    </w:p>
-    <w:p>
-      <w:proofErr w:type="spellStart"/>
-      <w:r>
-        <w:t>usp_Admission_DischargePatient</w:t>
-      </w:r>
-      <w:proofErr w:type="spellEnd"/>
-    </w:p>
-    <w:p>
-      <w:proofErr w:type="spellStart"/>
-      <w:r>
-        <w:t>usp_Admission_TransferPatient</w:t>
-      </w:r>
-      <w:proofErr w:type="spellEnd"/>
-    </w:p>
-    <w:p>
-      <w:proofErr w:type="spellStart"/>
-      <w:r>
-        <w:t>usp_Admission_GetActive</w:t>
-      </w:r>
-      <w:proofErr w:type="spellEnd"/>
-    </w:p>
-    <w:p>
-      <w:proofErr w:type="spellStart"/>
-      <w:r>
-        <w:t>usp_Admission_GetByPatient</w:t>
-      </w:r>
-      <w:proofErr w:type="spellEnd"/>
-    </w:p>
-    <w:p>
-      <w:r>
-        <w:t>Bed Management Procedures</w:t>
-      </w:r>
-    </w:p>
-    <w:p>
-      <w:r>
-        <w:t>text</w:t>
-      </w:r>
-    </w:p>
-    <w:p>
-      <w:proofErr w:type="spellStart"/>
-      <w:r>
-        <w:t>usp_Bed_GetAvailable</w:t>
-      </w:r>
-      <w:proofErr w:type="spellEnd"/>
-    </w:p>
-    <w:p>
-      <w:proofErr w:type="spellStart"/>
-      <w:r>
-        <w:t>usp_Bed_UpdateStatus</w:t>
-      </w:r>
-      <w:proofErr w:type="spellEnd"/>
-    </w:p>
-    <w:p>
-      <w:proofErr w:type="spellStart"/>
-      <w:r>
-        <w:t>usp_Bed_GetByWard</w:t>
-      </w:r>
-      <w:proofErr w:type="spellEnd"/>
-    </w:p>
-    <w:p>
-      <w:r>
-        <w:t>Ward Procedures</w:t>
-      </w:r>
-    </w:p>
-    <w:p>
-      <w:r>
-        <w:t>text</w:t>
-      </w:r>
-    </w:p>
-    <w:p>
-      <w:proofErr w:type="spellStart"/>
-      <w:r>
-        <w:t>usp_Ward_GetAll</w:t>
-      </w:r>
-      <w:proofErr w:type="spellEnd"/>
-    </w:p>
-    <w:p>
-      <w:proofErr w:type="spellStart"/>
-      <w:r>
-        <w:t>usp_Ward_GetAvailableBeds</w:t>
-      </w:r>
-      <w:proofErr w:type="spellEnd"/>
-    </w:p>
-    <w:p>
-      <w:r>
-        <w:t>EMERGENCY MANAGEMENT PROCEDURES</w:t>
-      </w:r>
-    </w:p>
-    <w:p>
-      <w:r>
-        <w:t>text</w:t>
-      </w:r>
-    </w:p>
-    <w:p>
-      <w:proofErr w:type="spellStart"/>
-      <w:r>
-        <w:t>usp_ERVisit_Register</w:t>
-      </w:r>
-      <w:proofErr w:type="spellEnd"/>
-    </w:p>
-    <w:p>
-      <w:proofErr w:type="spellStart"/>
-      <w:r>
-        <w:t>usp_ERVisit_UpdateDisposition</w:t>
-      </w:r>
-      <w:proofErr w:type="spellEnd"/>
-    </w:p>
-    <w:p>
-      <w:proofErr w:type="spellStart"/>
-      <w:r>
-        <w:t>usp_Triage_RecordAssessment</w:t>
-      </w:r>
-      <w:proofErr w:type="spellEnd"/>
-    </w:p>
-    <w:p>
-      <w:proofErr w:type="spellStart"/>
-      <w:r>
-        <w:t>usp_ERVisit_GetActive</w:t>
-      </w:r>
-      <w:proofErr w:type="spellEnd"/>
-    </w:p>
-    <w:p>
-      <w:r>
-        <w:t>OUTPATIENT MANAGEMENT PROCEDURES</w:t>
-      </w:r>
-    </w:p>
-    <w:p>
-      <w:r>
-        <w:t>text</w:t>
-      </w:r>
-    </w:p>
-    <w:p>
-      <w:proofErr w:type="spellStart"/>
-      <w:r>
-        <w:t>usp_OPDVisit_Register</w:t>
-      </w:r>
-      <w:proofErr w:type="spellEnd"/>
-    </w:p>
-    <w:p>
-      <w:proofErr w:type="spellStart"/>
-      <w:r>
-        <w:t>usp_OPDVisit_UpdateStatus</w:t>
-      </w:r>
-      <w:proofErr w:type="spellEnd"/>
-    </w:p>
-    <w:p>
-      <w:proofErr w:type="spellStart"/>
-      <w:r>
-        <w:t>usp_OPDVisit_GetByDate</w:t>
-      </w:r>
-      <w:proofErr w:type="spellEnd"/>
-    </w:p>
-    <w:p>
-      <w:r>
-        <w:t>LABORATORY MANAGEMENT PROCEDURES</w:t>
-      </w:r>
-    </w:p>
-    <w:p>
-      <w:r>
-        <w:lastRenderedPageBreak/>
-        <w:t>text</w:t>
-      </w:r>
-    </w:p>
-    <w:p>
-      <w:proofErr w:type="spellStart"/>
-      <w:r>
-        <w:t>usp_LabOrder_Create</w:t>
-      </w:r>
-      <w:proofErr w:type="spellEnd"/>
-    </w:p>
-    <w:p>
-      <w:proofErr w:type="spellStart"/>
-      <w:r>
-        <w:t>usp_LabOrder_UpdateStatus</w:t>
-      </w:r>
-      <w:proofErr w:type="spellEnd"/>
-    </w:p>
-    <w:p>
-      <w:proofErr w:type="spellStart"/>
-      <w:r>
-        <w:t>usp_LabResult_Enter</w:t>
-      </w:r>
-      <w:proofErr w:type="spellEnd"/>
-    </w:p>
-    <w:p>
-      <w:proofErr w:type="spellStart"/>
-      <w:r>
-        <w:t>usp_LabResult_Verify</w:t>
-      </w:r>
-      <w:proofErr w:type="spellEnd"/>
-    </w:p>
-    <w:p>
-      <w:proofErr w:type="spellStart"/>
-      <w:r>
-        <w:t>usp_LabOrder_GetPending</w:t>
-      </w:r>
-      <w:proofErr w:type="spellEnd"/>
-    </w:p>
-    <w:p>
-      <w:proofErr w:type="spellStart"/>
-      <w:r>
-        <w:t>usp_LabResult_GetByOrder</w:t>
-      </w:r>
-      <w:proofErr w:type="spellEnd"/>
-    </w:p>
-    <w:p>
-      <w:r>
-        <w:t>RADIOLOGY MANAGEMENT PROCEDURES</w:t>
-      </w:r>
-    </w:p>
-    <w:p>
-      <w:r>
-        <w:t>text</w:t>
-      </w:r>
-    </w:p>
-    <w:p>
-      <w:proofErr w:type="spellStart"/>
-      <w:r>
-        <w:t>usp_RadiologyOrder_Create</w:t>
-      </w:r>
-      <w:proofErr w:type="spellEnd"/>
-    </w:p>
-    <w:p>
-      <w:proofErr w:type="spellStart"/>
-      <w:r>
-        <w:t>usp_ImagingStudy_Schedule</w:t>
-      </w:r>
-      <w:proofErr w:type="spellEnd"/>
-    </w:p>
-    <w:p>
-      <w:proofErr w:type="spellStart"/>
-      <w:r>
-        <w:t>usp_RadiologyReport_Create</w:t>
-      </w:r>
-      <w:proofErr w:type="spellEnd"/>
-    </w:p>
-    <w:p>
-      <w:proofErr w:type="spellStart"/>
-      <w:r>
-        <w:t>usp_RadiologyReport_Update</w:t>
-      </w:r>
-      <w:proofErr w:type="spellEnd"/>
-    </w:p>
-    <w:p>
-      <w:proofErr w:type="spellStart"/>
-      <w:r>
-        <w:t>usp_ImagingStudy_GetByPatient</w:t>
-      </w:r>
-      <w:proofErr w:type="spellEnd"/>
-    </w:p>
-    <w:p>
-      <w:r>
-        <w:t>SURGERY MANAGEMENT PROCEDURES</w:t>
-      </w:r>
-    </w:p>
-    <w:p>
-      <w:r>
-        <w:t>text</w:t>
-      </w:r>
-    </w:p>
-    <w:p>
-      <w:proofErr w:type="spellStart"/>
-      <w:proofErr w:type="gramStart"/>
-      <w:r>
-        <w:t>usp</w:t>
-      </w:r>
-      <w:proofErr w:type="gramEnd"/>
-      <w:r>
-        <w:t>_Surgery_Schedule</w:t>
-      </w:r>
-      <w:proofErr w:type="spellEnd"/>
-    </w:p>
-    <w:p>
-      <w:proofErr w:type="spellStart"/>
-      <w:r>
-        <w:t>usp_Surgery_UpdateStatus</w:t>
-      </w:r>
-      <w:proofErr w:type="spellEnd"/>
-    </w:p>
-    <w:p>
-      <w:proofErr w:type="spellStart"/>
-      <w:r>
-        <w:t>usp_SurgeryTeam_Assign</w:t>
-      </w:r>
-      <w:proofErr w:type="spellEnd"/>
-    </w:p>
-    <w:p>
-      <w:proofErr w:type="spellStart"/>
-      <w:r>
-        <w:t>usp_SurgeryNotes_Record</w:t>
-      </w:r>
-      <w:proofErr w:type="spellEnd"/>
-    </w:p>
-    <w:p>
-      <w:proofErr w:type="spellStart"/>
-      <w:r>
-        <w:t>usp_Surgery_GetBySurgeon</w:t>
-      </w:r>
-      <w:proofErr w:type="spellEnd"/>
-    </w:p>
-    <w:p>
-      <w:proofErr w:type="spellStart"/>
-      <w:r>
-        <w:t>usp_Surgery_GetScheduled</w:t>
-      </w:r>
-      <w:proofErr w:type="spellEnd"/>
-    </w:p>
-    <w:p>
-      <w:r>
-        <w:t>FINANCE MANAGEMENT PROCEDURES</w:t>
-      </w:r>
-    </w:p>
-    <w:p>
-      <w:r>
-        <w:t>Billing Procedures</w:t>
-      </w:r>
-    </w:p>
-    <w:p>
-      <w:r>
-        <w:t>text</w:t>
-      </w:r>
-    </w:p>
-    <w:p>
-      <w:proofErr w:type="spellStart"/>
-      <w:r>
-        <w:t>usp_Invoice_Generate</w:t>
-      </w:r>
-      <w:proofErr w:type="spellEnd"/>
-    </w:p>
-    <w:p>
-      <w:proofErr w:type="spellStart"/>
-      <w:r>
-        <w:t>usp_Invoice_UpdateStatus</w:t>
-      </w:r>
-      <w:proofErr w:type="spellEnd"/>
-    </w:p>
-    <w:p>
-      <w:proofErr w:type="spellStart"/>
-      <w:r>
-        <w:t>usp_Payment_Process</w:t>
-      </w:r>
-      <w:proofErr w:type="spellEnd"/>
-    </w:p>
-    <w:p>
-      <w:proofErr w:type="spellStart"/>
-      <w:r>
         <w:t>usp_Invoice_GetByPatient</w:t>
       </w:r>
       <w:proofErr w:type="spellEnd"/>
@@ -1104,7 +1105,6 @@
     <w:p>
       <w:proofErr w:type="spellStart"/>
       <w:r>
-        <w:lastRenderedPageBreak/>
         <w:t>usp_Invoice_GetOutstanding</w:t>
       </w:r>
       <w:proofErr w:type="spellEnd"/>

</xml_diff>